<commit_message>
Point everything at the new live address medreach-2.onrender.com
The site now runs on the Medreach-2 Render service. Replaced the old
medreach-wtne.onrender.com address in the README, the Canva prompt and
outline, all presentation decks (.pptx, text replaced inside the slide
XML so the design is untouched) and all PDFs (submission documents
re-rendered from their sources, deck PDFs re-exported). Text of every
PDF was compared with the previous version: only the address changed
(plus one line re-wrapping).

Co-Authored-By: Claude Opus 5.5 <noreply@anthropic.com>
Claude-Session: https://claude.ai/code/session_01WQThQGKWCG3rzyNT6Xw93E
</commit_message>
<xml_diff>
--- a/public/downloads/Medreach-Canva-Outline.docx
+++ b/public/downloads/Medreach-Canva-Outline.docx
@@ -87,7 +87,7 @@
         </w:numPr>
       </w:pPr>
       <w:r>
-        <w:t xml:space="preserve">Live demo: medreach-wtne.onrender.com · Code: github.com/prakharporwal518-collab/Medreach</w:t>
+        <w:t xml:space="preserve">Live demo: medreach-2.onrender.com · Code: github.com/prakharporwal518-collab/Medreach</w:t>
       </w:r>
     </w:p>
     <w:p>
@@ -1152,7 +1152,7 @@
         </w:numPr>
       </w:pPr>
       <w:r>
-        <w:t xml:space="preserve">Live demo: medreach-wtne.onrender.com · Code: github.com/prakharporwal518-collab/Medreach · Hospital login: Bansal Hospital, BANSAL-ED01</w:t>
+        <w:t xml:space="preserve">Live demo: medreach-2.onrender.com · Code: github.com/prakharporwal518-collab/Medreach · Hospital login: Bansal Hospital, BANSAL-ED01</w:t>
       </w:r>
     </w:p>
     <w:sectPr>

</xml_diff>